<commit_message>
Add lecture 9 material and related updates.
</commit_message>
<xml_diff>
--- a/CS301R-Course-Summary.docx
+++ b/CS301R-Course-Summary.docx
@@ -1530,7 +1530,36 @@
         <w:t xml:space="preserve"> </w:t>
       </w:r>
       <w:r>
-        <w:t xml:space="preserve">— each student delivers a persuasive pitch that both defends the idea and recruits classmates. Selection is a blend: peers evaluate and signal interest, authors recruit, and the instructor gives input and has final say on which ideas are rich and feasible enough to anchor a team. Teams then form around the surviving ideas (~2–4 people; the count is emergent), or a student may continue</w:t>
+        <w:t xml:space="preserve">— each student delivers a persuasive pitch that both defends the idea and recruits classmates. Selection is a blend: peers evaluate and signal interest, authors recruit, and the instructor gives input and has final say on which ideas are rich and feasible enough to anchor a team. Evaluation happens live;</w:t>
+      </w:r>
+      <w:r>
+        <w:t xml:space="preserve"> </w:t>
+      </w:r>
+      <w:r>
+        <w:rPr>
+          <w:bCs/>
+          <w:b/>
+        </w:rPr>
+        <w:t xml:space="preserve">commitment does not.</w:t>
+      </w:r>
+      <w:r>
+        <w:t xml:space="preserve"> </w:t>
+      </w:r>
+      <w:r>
+        <w:t xml:space="preserve">Pitch Day ends with the anchor ideas announced and a private ranked preference from every student; the anchor projects’ written proposals go up for the weekend;</w:t>
+      </w:r>
+      <w:r>
+        <w:t xml:space="preserve"> </w:t>
+      </w:r>
+      <w:r>
+        <w:rPr>
+          <w:bCs/>
+          <w:b/>
+        </w:rPr>
+        <w:t xml:space="preserve">teams are announced Mon, Oct 12</w:t>
+      </w:r>
+      <w:r>
+        <w:t xml:space="preserve">, and charters are written that day in class. A student may instead continue</w:t>
       </w:r>
       <w:r>
         <w:t xml:space="preserve"> </w:t>
@@ -2319,7 +2348,7 @@
               <w:t xml:space="preserve"> </w:t>
             </w:r>
             <w:r>
-              <w:t xml:space="preserve">— persuade, recruit, peer scoring, selection, team formation</w:t>
+              <w:t xml:space="preserve">— persuade, recruit, peer scoring, selection, ranked preferences</w:t>
             </w:r>
           </w:p>
         </w:tc>
@@ -2357,7 +2386,7 @@
               <w:t xml:space="preserve"> </w:t>
             </w:r>
             <w:r>
-              <w:t xml:space="preserve">+ teams form (Oct 7)</w:t>
+              <w:t xml:space="preserve">(Oct 7)</w:t>
             </w:r>
           </w:p>
         </w:tc>
@@ -2395,19 +2424,26 @@
               <w:jc w:val="left"/>
             </w:pPr>
             <w:r>
-              <w:t xml:space="preserve">Design documents in software engineering; appropriate detail vs. over-specification; architecture and data-flow diagram workshop on the team’s project</w:t>
-            </w:r>
-          </w:p>
-        </w:tc>
-        <w:tc>
-          <w:tcPr/>
-          <w:p>
-            <w:pPr>
-              <w:pStyle w:val="Compact"/>
-              <w:jc w:val="left"/>
-            </w:pPr>
-            <w:r>
-              <w:t xml:space="preserve">Team Charter (Oct 12); design doc draft (Oct 14)</w:t>
+              <w:rPr>
+                <w:bCs/>
+                <w:b/>
+              </w:rPr>
+              <w:t xml:space="preserve">Teams announced</w:t>
+            </w:r>
+            <w:r>
+              <w:t xml:space="preserve">; design documents in software engineering; appropriate detail vs. over-specification; architecture and data-flow diagram workshop on the team’s project</w:t>
+            </w:r>
+          </w:p>
+        </w:tc>
+        <w:tc>
+          <w:tcPr/>
+          <w:p>
+            <w:pPr>
+              <w:pStyle w:val="Compact"/>
+              <w:jc w:val="left"/>
+            </w:pPr>
+            <w:r>
+              <w:t xml:space="preserve">Team Charter written in class (Oct 12); design doc draft (Oct 14)</w:t>
             </w:r>
           </w:p>
         </w:tc>
@@ -3777,7 +3813,7 @@
                 <w:iCs/>
                 <w:i/>
               </w:rPr>
-              <w:t xml:space="preserve">License/OSS short response · Team Charter · MVP Plan</w:t>
+              <w:t xml:space="preserve">License/OSS short response · Team Charter (written in class Oct 12) · MVP Plan</w:t>
             </w:r>
           </w:p>
         </w:tc>

</xml_diff>

<commit_message>
Updates for lectures 3 & 4 and adding ability to add animations to slide decks.
</commit_message>
<xml_diff>
--- a/CS301R-Course-Summary.docx
+++ b/CS301R-Course-Summary.docx
@@ -2218,7 +2218,7 @@
               <w:jc w:val="left"/>
             </w:pPr>
             <w:r>
-              <w:t xml:space="preserve">License/OSS response (Sep 21);</w:t>
+              <w:t xml:space="preserve">Discovery Notes and License/OSS response (Sep 21);</w:t>
             </w:r>
             <w:r>
               <w:t xml:space="preserve"> </w:t>
@@ -3813,7 +3813,7 @@
                 <w:iCs/>
                 <w:i/>
               </w:rPr>
-              <w:t xml:space="preserve">License/OSS short response · Team Charter (written in class Oct 12) · MVP Plan</w:t>
+              <w:t xml:space="preserve">Discovery Notes · License/OSS short response · Team Charter (written in class Oct 12) · MVP Plan</w:t>
             </w:r>
           </w:p>
         </w:tc>

</xml_diff>

<commit_message>
Build Session 16 and publish CP7 for solo founders
CP7 is now due Fri, Oct 30 (CP7_DUE), so a solo founder starts the
front door in the Session 16 workshop and finishes it outside class.
The setup guide becomes a placeholder until there's code to set up;
the full guide and its cold test move to Session 20.

- CP7 rubric rewritten student-facing and published. A missing
  partner read caps Newcomer usability at Proficient.
- Submission: tag main as cp7, then submit the tag URL and a photo
  of the Stranger's Read sheet (Canvas text entry).
- Session 16: outline v2, deck (tools/build-session16.js), student
  page, and the Stranger's Read half-sheet.
- Session 15 page, outline, and deck updated to match.
- demos/prop-loft-states: Prop Loft's session tags, plus the scripts
  that publish the states and seed a tag's issues.

Co-Authored-By: Claude Opus 5.5 (1M context) <noreply@anthropic.com>
</commit_message>
<xml_diff>
--- a/CS301R-Course-Summary.docx
+++ b/CS301R-Course-Summary.docx
@@ -2595,7 +2595,7 @@
               <w:t xml:space="preserve"> </w:t>
             </w:r>
             <w:r>
-              <w:t xml:space="preserve">(Oct 28); CP9 portfolio opens</w:t>
+              <w:t xml:space="preserve">(Oct 30); CP9 portfolio opens</w:t>
             </w:r>
           </w:p>
         </w:tc>
@@ -3513,7 +3513,7 @@
               <w:jc w:val="left"/>
             </w:pPr>
             <w:r>
-              <w:t xml:space="preserve">README, LICENSE, CONTRIBUTING, CODE_OF_CONDUCT, issue and PR templates, setup and onboarding guide, communication and maintainer norms</w:t>
+              <w:t xml:space="preserve">README, LICENSE, CONTRIBUTING, CODE_OF_CONDUCT, issue and PR templates, communication and maintainer norms, a setup placeholder (the full setup guide is written and cold-tested in Week 10)</w:t>
             </w:r>
           </w:p>
         </w:tc>

</xml_diff>

<commit_message>
Start the build in Session 17 and move setup-guide writing out of Session 20
- Session 17: "the build starts today" with a walking skeleton (new slide 4,
  outline, student page); Session 18 builds the slice on it
- Session 20 v3: guide written before class, 30-min cold test, plan revision
  after class; student page, 15-slide deck, MVP Plan Review sheet
- MVP Plan: say the Nov 11 revision is the version CP10 scores
- Args tables: escape inline HTML so Submit lines keep their spaces
  (MVP Plan, CP7, CP10, CP3/CP5 drafts)
- Blocker board leaves Session 20; it is introduced in Session 21
- Prop Loft session-20 publish moved before Session 19 in the checklist

Co-Authored-By: Claude Opus 5.5 <noreply@anthropic.com>
</commit_message>
<xml_diff>
--- a/CS301R-Course-Summary.docx
+++ b/CS301R-Course-Summary.docx
@@ -2633,7 +2633,17 @@
               <w:jc w:val="left"/>
             </w:pPr>
             <w:r>
-              <w:t xml:space="preserve">Turning proposal and design into epics, milestones, and issues; estimation, sequencing, definition of done; contribution pathways for newcomers; planning the vertical slice</w:t>
+              <w:rPr>
+                <w:bCs/>
+                <w:b/>
+              </w:rPr>
+              <w:t xml:space="preserve">The build starts</w:t>
+            </w:r>
+            <w:r>
+              <w:t xml:space="preserve"> </w:t>
+            </w:r>
+            <w:r>
+              <w:t xml:space="preserve">with a walking skeleton; turning proposal and design into epics, milestones, and issues; estimation, sequencing, definition of done; contribution pathways for newcomers; planning the vertical slice</w:t>
             </w:r>
           </w:p>
         </w:tc>

</xml_diff>